<commit_message>
Use AI service URL via VITE_AI_BASE_URL
</commit_message>
<xml_diff>
--- a/Campuslearn.docx
+++ b/Campuslearn.docx
@@ -21810,69 +21810,79 @@
           <w:szCs w:val="44"/>
         </w:rPr>
       </w:pPr>
-    </w:p>
-    <w:p>
-      <w:pPr>
+      <w:proofErr w:type="gramStart"/>
+      <w:r>
         <w:rPr>
           <w:sz w:val="36"/>
           <w:szCs w:val="44"/>
         </w:rPr>
-      </w:pPr>
+        <w:t>Aiservice :</w:t>
+      </w:r>
+      <w:proofErr w:type="gramEnd"/>
       <w:r>
         <w:rPr>
           <w:sz w:val="36"/>
           <w:szCs w:val="44"/>
         </w:rPr>
-        <w:t xml:space="preserve">Ai services </w:t>
-      </w:r>
-      <w:proofErr w:type="gramStart"/>
-      <w:r>
+        <w:t xml:space="preserve">- </w:t>
+      </w:r>
+      <w:hyperlink r:id="rId16" w:history="1">
+        <w:r>
+          <w:rPr>
+            <w:rStyle w:val="Hyperlink"/>
+            <w:sz w:val="36"/>
+            <w:szCs w:val="44"/>
+          </w:rPr>
+          <w:t>https://campus-learn-lms-aiservice.onrender.com</w:t>
+        </w:r>
+      </w:hyperlink>
+    </w:p>
+    <w:p>
+      <w:pPr>
         <w:rPr>
           <w:sz w:val="36"/>
           <w:szCs w:val="44"/>
         </w:rPr>
-        <w:t>link :</w:t>
-      </w:r>
-      <w:proofErr w:type="gramEnd"/>
-      <w:r>
+      </w:pPr>
+    </w:p>
+    <w:p>
+      <w:pPr>
         <w:rPr>
           <w:sz w:val="36"/>
           <w:szCs w:val="44"/>
         </w:rPr>
-        <w:t xml:space="preserve">- </w:t>
-      </w:r>
-    </w:p>
-    <w:p>
-      <w:pPr>
+      </w:pPr>
+      <w:r>
         <w:rPr>
           <w:sz w:val="36"/>
           <w:szCs w:val="44"/>
         </w:rPr>
-      </w:pPr>
-    </w:p>
-    <w:p>
-      <w:pPr>
+        <w:t xml:space="preserve">Ai services </w:t>
+      </w:r>
+      <w:proofErr w:type="gramStart"/>
+      <w:r>
         <w:rPr>
           <w:sz w:val="36"/>
           <w:szCs w:val="44"/>
         </w:rPr>
-      </w:pPr>
-      <w:proofErr w:type="gramStart"/>
+        <w:t>link :</w:t>
+      </w:r>
+      <w:proofErr w:type="gramEnd"/>
       <w:r>
         <w:rPr>
           <w:sz w:val="36"/>
           <w:szCs w:val="44"/>
         </w:rPr>
-        <w:t>Error:-</w:t>
-      </w:r>
-      <w:proofErr w:type="gramEnd"/>
-      <w:r>
+        <w:t xml:space="preserve">- </w:t>
+      </w:r>
+    </w:p>
+    <w:p>
+      <w:pPr>
         <w:rPr>
           <w:sz w:val="36"/>
           <w:szCs w:val="44"/>
         </w:rPr>
-        <w:t xml:space="preserve"> deployment </w:t>
-      </w:r>
+      </w:pPr>
     </w:p>
     <w:p>
       <w:pPr>
@@ -21881,11 +21891,36 @@
           <w:szCs w:val="44"/>
         </w:rPr>
       </w:pPr>
+      <w:proofErr w:type="gramStart"/>
       <w:r>
         <w:rPr>
           <w:sz w:val="36"/>
           <w:szCs w:val="44"/>
         </w:rPr>
+        <w:t>Error:-</w:t>
+      </w:r>
+      <w:proofErr w:type="gramEnd"/>
+      <w:r>
+        <w:rPr>
+          <w:sz w:val="36"/>
+          <w:szCs w:val="44"/>
+        </w:rPr>
+        <w:t xml:space="preserve"> deployment </w:t>
+      </w:r>
+    </w:p>
+    <w:p>
+      <w:pPr>
+        <w:rPr>
+          <w:sz w:val="36"/>
+          <w:szCs w:val="44"/>
+        </w:rPr>
+      </w:pPr>
+      <w:r>
+        <w:rPr>
+          <w:sz w:val="36"/>
+          <w:szCs w:val="44"/>
+        </w:rPr>
+        <w:lastRenderedPageBreak/>
         <w:drawing>
           <wp:inline distT="0" distB="0" distL="0" distR="0" wp14:anchorId="071E4817" wp14:editId="7DD34395">
             <wp:extent cx="5731510" cy="3070225"/>
@@ -21902,7 +21937,7 @@
                     <pic:cNvPicPr/>
                   </pic:nvPicPr>
                   <pic:blipFill>
-                    <a:blip r:embed="rId16"/>
+                    <a:blip r:embed="rId17"/>
                     <a:stretch>
                       <a:fillRect/>
                     </a:stretch>
@@ -21942,7 +21977,6 @@
           <w:sz w:val="28"/>
           <w:szCs w:val="36"/>
         </w:rPr>
-        <w:lastRenderedPageBreak/>
         <w:t>404: NOT_FOUND</w:t>
       </w:r>
       <w:r>
@@ -22353,6 +22387,7 @@
         <w:rPr>
           <w:color w:val="000000" w:themeColor="text1"/>
         </w:rPr>
+        <w:lastRenderedPageBreak/>
         <w:t xml:space="preserve">    </w:t>
       </w:r>
       <w:proofErr w:type="gramStart"/>
@@ -22490,23 +22525,6 @@
         </w:rPr>
         <w:t>}</w:t>
       </w:r>
-    </w:p>
-    <w:p>
-      <w:pPr>
-        <w:pBdr>
-          <w:top w:val="single" w:sz="4" w:space="1" w:color="auto"/>
-          <w:left w:val="single" w:sz="4" w:space="4" w:color="auto"/>
-          <w:bottom w:val="single" w:sz="4" w:space="1" w:color="auto"/>
-          <w:right w:val="single" w:sz="4" w:space="4" w:color="auto"/>
-        </w:pBdr>
-        <w:rPr>
-          <w:b/>
-          <w:bCs/>
-          <w:color w:val="EE0000"/>
-          <w:sz w:val="28"/>
-          <w:szCs w:val="36"/>
-        </w:rPr>
-      </w:pPr>
     </w:p>
     <w:p>
       <w:pPr>
@@ -22531,7 +22549,98 @@
           <w:sz w:val="28"/>
           <w:szCs w:val="36"/>
         </w:rPr>
-        <w:t xml:space="preserve">=&gt; </w:t>
+        <w:br/>
+      </w:r>
+      <w:r>
+        <w:rPr>
+          <w:b/>
+          <w:bCs/>
+          <w:color w:val="EE0000"/>
+          <w:sz w:val="28"/>
+          <w:szCs w:val="36"/>
+        </w:rPr>
+        <w:br/>
+      </w:r>
+      <w:r>
+        <w:rPr>
+          <w:b/>
+          <w:bCs/>
+          <w:color w:val="EE0000"/>
+          <w:sz w:val="28"/>
+          <w:szCs w:val="36"/>
+        </w:rPr>
+        <w:br/>
+      </w:r>
+      <w:r>
+        <w:rPr>
+          <w:b/>
+          <w:bCs/>
+          <w:color w:val="EE0000"/>
+          <w:sz w:val="28"/>
+          <w:szCs w:val="36"/>
+        </w:rPr>
+        <w:br/>
+      </w:r>
+      <w:r>
+        <w:rPr>
+          <w:b/>
+          <w:bCs/>
+          <w:color w:val="EE0000"/>
+          <w:sz w:val="28"/>
+          <w:szCs w:val="36"/>
+        </w:rPr>
+        <w:br/>
+      </w:r>
+      <w:r>
+        <w:rPr>
+          <w:b/>
+          <w:bCs/>
+          <w:color w:val="EE0000"/>
+          <w:sz w:val="28"/>
+          <w:szCs w:val="36"/>
+        </w:rPr>
+        <w:br/>
+      </w:r>
+      <w:r>
+        <w:rPr>
+          <w:b/>
+          <w:bCs/>
+          <w:color w:val="EE0000"/>
+          <w:sz w:val="28"/>
+          <w:szCs w:val="36"/>
+        </w:rPr>
+        <w:br/>
+      </w:r>
+      <w:r>
+        <w:rPr>
+          <w:b/>
+          <w:bCs/>
+          <w:color w:val="EE0000"/>
+          <w:sz w:val="28"/>
+          <w:szCs w:val="36"/>
+        </w:rPr>
+        <w:br/>
+      </w:r>
+      <w:r>
+        <w:rPr>
+          <w:b/>
+          <w:bCs/>
+          <w:color w:val="EE0000"/>
+          <w:sz w:val="28"/>
+          <w:szCs w:val="36"/>
+        </w:rPr>
+        <w:br/>
+        <w:t>2.</w:t>
+      </w:r>
+      <w:r>
+        <w:rPr>
+          <w:b/>
+          <w:bCs/>
+          <w:color w:val="EE0000"/>
+          <w:sz w:val="28"/>
+          <w:szCs w:val="36"/>
+        </w:rPr>
+        <w:t xml:space="preserve"> </w:t>
       </w:r>
       <w:r>
         <w:rPr>

</xml_diff>